<commit_message>
- parametre med lambda i stedet for type-cast af "object". - løsningforslag, som compiler med .NET 10
</commit_message>
<xml_diff>
--- a/05 Parallel programming/Threading-Exercises.docx
+++ b/05 Parallel programming/Threading-Exercises.docx
@@ -1,6 +1,6 @@
 
 <file path=word/document.xml><?xml version="1.0" encoding="utf-8"?>
-<w:document xmlns:wpc="http://schemas.microsoft.com/office/word/2010/wordprocessingCanvas" xmlns:cx="http://schemas.microsoft.com/office/drawing/2014/chartex" xmlns:cx1="http://schemas.microsoft.com/office/drawing/2015/9/8/chartex" xmlns:mc="http://schemas.openxmlformats.org/markup-compatibility/2006" xmlns:o="urn:schemas-microsoft-com:office:office" xmlns:r="http://schemas.openxmlformats.org/officeDocument/2006/relationships" xmlns:m="http://schemas.openxmlformats.org/officeDocument/2006/math" xmlns:v="urn:schemas-microsoft-com:vml" xmlns:wp14="http://schemas.microsoft.com/office/word/2010/wordprocessingDrawing" xmlns:wp="http://schemas.openxmlformats.org/drawingml/2006/wordprocessingDrawing" xmlns:w10="urn:schemas-microsoft-com:office:word" xmlns:w="http://schemas.openxmlformats.org/wordprocessingml/2006/main" xmlns:w14="http://schemas.microsoft.com/office/word/2010/wordml" xmlns:w15="http://schemas.microsoft.com/office/word/2012/wordml" xmlns:w16se="http://schemas.microsoft.com/office/word/2015/wordml/symex" xmlns:wpg="http://schemas.microsoft.com/office/word/2010/wordprocessingGroup" xmlns:wpi="http://schemas.microsoft.com/office/word/2010/wordprocessingInk" xmlns:wne="http://schemas.microsoft.com/office/word/2006/wordml" xmlns:wps="http://schemas.microsoft.com/office/word/2010/wordprocessingShape" mc:Ignorable="w14 w15 w16se wp14">
+<w:document xmlns:wpc="http://schemas.microsoft.com/office/word/2010/wordprocessingCanvas" xmlns:cx="http://schemas.microsoft.com/office/drawing/2014/chartex" xmlns:cx1="http://schemas.microsoft.com/office/drawing/2015/9/8/chartex" xmlns:cx2="http://schemas.microsoft.com/office/drawing/2015/10/21/chartex" xmlns:cx3="http://schemas.microsoft.com/office/drawing/2016/5/9/chartex" xmlns:cx4="http://schemas.microsoft.com/office/drawing/2016/5/10/chartex" xmlns:cx5="http://schemas.microsoft.com/office/drawing/2016/5/11/chartex" xmlns:cx6="http://schemas.microsoft.com/office/drawing/2016/5/12/chartex" xmlns:cx7="http://schemas.microsoft.com/office/drawing/2016/5/13/chartex" xmlns:cx8="http://schemas.microsoft.com/office/drawing/2016/5/14/chartex" xmlns:mc="http://schemas.openxmlformats.org/markup-compatibility/2006" xmlns:aink="http://schemas.microsoft.com/office/drawing/2016/ink" xmlns:am3d="http://schemas.microsoft.com/office/drawing/2017/model3d" xmlns:o="urn:schemas-microsoft-com:office:office" xmlns:oel="http://schemas.microsoft.com/office/2019/extlst" xmlns:r="http://schemas.openxmlformats.org/officeDocument/2006/relationships" xmlns:m="http://schemas.openxmlformats.org/officeDocument/2006/math" xmlns:v="urn:schemas-microsoft-com:vml" xmlns:wp14="http://schemas.microsoft.com/office/word/2010/wordprocessingDrawing" xmlns:wp="http://schemas.openxmlformats.org/drawingml/2006/wordprocessingDrawing" xmlns:w10="urn:schemas-microsoft-com:office:word" xmlns:w="http://schemas.openxmlformats.org/wordprocessingml/2006/main" xmlns:w14="http://schemas.microsoft.com/office/word/2010/wordml" xmlns:w15="http://schemas.microsoft.com/office/word/2012/wordml" xmlns:w16cex="http://schemas.microsoft.com/office/word/2018/wordml/cex" xmlns:w16cid="http://schemas.microsoft.com/office/word/2016/wordml/cid" xmlns:w16="http://schemas.microsoft.com/office/word/2018/wordml" xmlns:w16du="http://schemas.microsoft.com/office/word/2023/wordml/word16du" xmlns:w16sdtdh="http://schemas.microsoft.com/office/word/2020/wordml/sdtdatahash" xmlns:w16sdtfl="http://schemas.microsoft.com/office/word/2024/wordml/sdtformatlock" xmlns:w16se="http://schemas.microsoft.com/office/word/2015/wordml/symex" xmlns:wpg="http://schemas.microsoft.com/office/word/2010/wordprocessingGroup" xmlns:wpi="http://schemas.microsoft.com/office/word/2010/wordprocessingInk" xmlns:wne="http://schemas.microsoft.com/office/word/2006/wordml" xmlns:wps="http://schemas.microsoft.com/office/word/2010/wordprocessingShape" mc:Ignorable="w14 w15 w16se w16cid w16 w16cex w16sdtdh w16sdtfl w16du wp14">
   <w:body>
     <w:p>
       <w:pPr>
@@ -259,21 +259,7 @@
         <w:rPr>
           <w:lang w:val="en-US"/>
         </w:rPr>
-        <w:t xml:space="preserve">e.g. “Hello from writer </w:t>
-      </w:r>
-      <w:proofErr w:type="gramStart"/>
-      <w:r>
-        <w:rPr>
-          <w:lang w:val="en-US"/>
-        </w:rPr>
-        <w:t>A</w:t>
-      </w:r>
-      <w:proofErr w:type="gramEnd"/>
-      <w:r>
-        <w:rPr>
-          <w:lang w:val="en-US"/>
-        </w:rPr>
-        <w:t xml:space="preserve"> #394”.</w:t>
+        <w:t>e.g. “Hello from writer A #394”.</w:t>
       </w:r>
     </w:p>
     <w:p>
@@ -399,6 +385,7 @@
         <w:t xml:space="preserve"> and make the other thread run the </w:t>
       </w:r>
       <w:proofErr w:type="spellStart"/>
+      <w:proofErr w:type="gramStart"/>
       <w:r>
         <w:rPr>
           <w:i/>
@@ -412,7 +399,15 @@
           <w:i/>
           <w:lang w:val="en-US"/>
         </w:rPr>
-        <w:t>()</w:t>
+        <w:t>(</w:t>
+      </w:r>
+      <w:proofErr w:type="gramEnd"/>
+      <w:r>
+        <w:rPr>
+          <w:i/>
+          <w:lang w:val="en-US"/>
+        </w:rPr>
+        <w:t>)</w:t>
       </w:r>
       <w:r>
         <w:rPr>
@@ -637,69 +632,360 @@
         <w:rPr>
           <w:lang w:val="en-US"/>
         </w:rPr>
-        <w:t xml:space="preserve">Pass the number of times to loop in the </w:t>
-      </w:r>
-      <w:proofErr w:type="gramStart"/>
+        <w:t xml:space="preserve">Pass the number of times to loop </w:t>
+      </w:r>
+      <w:r>
+        <w:rPr>
+          <w:lang w:val="en-US"/>
+        </w:rPr>
+        <w:t>in a lambda expression, when you create the thread</w:t>
+      </w:r>
+      <w:r>
+        <w:rPr>
+          <w:lang w:val="en-US"/>
+        </w:rPr>
+        <w:t>.</w:t>
+      </w:r>
+    </w:p>
+    <w:p>
+      <w:pPr>
+        <w:rPr>
+          <w:lang w:val="en-US"/>
+        </w:rPr>
+      </w:pPr>
+    </w:p>
+    <w:p>
+      <w:pPr>
+        <w:rPr>
+          <w:lang w:val="en-US"/>
+        </w:rPr>
+      </w:pPr>
+      <w:r>
+        <w:rPr>
+          <w:lang w:val="en-US"/>
+        </w:rPr>
+        <w:t>Try implementing all three ways (one at the time).</w:t>
+      </w:r>
+    </w:p>
+    <w:p>
+      <w:pPr>
+        <w:rPr>
+          <w:lang w:val="en-US"/>
+        </w:rPr>
+      </w:pPr>
+      <w:r>
+        <w:rPr>
+          <w:lang w:val="en-US"/>
+        </w:rPr>
+        <w:t xml:space="preserve">Discuss with another student: Are there any benefits or drawbacks </w:t>
+      </w:r>
+      <w:r>
+        <w:rPr>
+          <w:lang w:val="en-US"/>
+        </w:rPr>
+        <w:t>of the different methods above?</w:t>
+      </w:r>
+    </w:p>
+    <w:p>
+      <w:pPr>
+        <w:rPr>
+          <w:b/>
+          <w:lang w:val="en-US"/>
+        </w:rPr>
+      </w:pPr>
+    </w:p>
+    <w:p>
+      <w:pPr>
+        <w:rPr>
+          <w:b/>
+          <w:lang w:val="en-US"/>
+        </w:rPr>
+      </w:pPr>
+      <w:r>
+        <w:rPr>
+          <w:b/>
+          <w:lang w:val="en-US"/>
+        </w:rPr>
+        <w:t>Exercise 3</w:t>
+      </w:r>
+      <w:r>
+        <w:rPr>
+          <w:b/>
+          <w:lang w:val="en-US"/>
+        </w:rPr>
+        <w:t>:</w:t>
+      </w:r>
+    </w:p>
+    <w:p>
+      <w:pPr>
+        <w:rPr>
+          <w:lang w:val="en-US"/>
+        </w:rPr>
+      </w:pPr>
+      <w:r>
+        <w:rPr>
+          <w:lang w:val="en-US"/>
+        </w:rPr>
+        <w:t xml:space="preserve">Make your </w:t>
+      </w:r>
+      <w:proofErr w:type="spellStart"/>
+      <w:r>
+        <w:rPr>
+          <w:lang w:val="en-US"/>
+        </w:rPr>
+        <w:t>HelloWriters</w:t>
+      </w:r>
+      <w:proofErr w:type="spellEnd"/>
+      <w:r>
+        <w:rPr>
+          <w:lang w:val="en-US"/>
+        </w:rPr>
+        <w:t xml:space="preserve"> sleep between each output. One should sleep 200 </w:t>
+      </w:r>
+      <w:proofErr w:type="spellStart"/>
+      <w:r>
+        <w:rPr>
+          <w:lang w:val="en-US"/>
+        </w:rPr>
+        <w:t>ms</w:t>
+      </w:r>
+      <w:proofErr w:type="spellEnd"/>
+      <w:r>
+        <w:rPr>
+          <w:lang w:val="en-US"/>
+        </w:rPr>
+        <w:t xml:space="preserve"> and one should sleep 500 </w:t>
+      </w:r>
+      <w:proofErr w:type="spellStart"/>
+      <w:r>
+        <w:rPr>
+          <w:lang w:val="en-US"/>
+        </w:rPr>
+        <w:t>ms.</w:t>
+      </w:r>
+      <w:proofErr w:type="spellEnd"/>
+    </w:p>
+    <w:p>
+      <w:pPr>
+        <w:rPr>
+          <w:lang w:val="en-US"/>
+        </w:rPr>
+      </w:pPr>
+    </w:p>
+    <w:p>
+      <w:pPr>
+        <w:rPr>
+          <w:b/>
+          <w:lang w:val="en-US"/>
+        </w:rPr>
+      </w:pPr>
+      <w:r>
+        <w:rPr>
+          <w:b/>
+          <w:lang w:val="en-US"/>
+        </w:rPr>
+        <w:t>Exercise 4:</w:t>
+      </w:r>
+    </w:p>
+    <w:p>
+      <w:pPr>
+        <w:rPr>
+          <w:lang w:val="en-US"/>
+        </w:rPr>
+      </w:pPr>
+      <w:r>
+        <w:rPr>
+          <w:lang w:val="en-US"/>
+        </w:rPr>
+        <w:t>Make your main thread (the one staring the other threads) write “Hello from main” after starting the threads.</w:t>
+      </w:r>
+    </w:p>
+    <w:p>
+      <w:pPr>
+        <w:rPr>
+          <w:lang w:val="en-US"/>
+        </w:rPr>
+      </w:pPr>
+      <w:r>
+        <w:rPr>
+          <w:lang w:val="en-US"/>
+        </w:rPr>
+        <w:t>Observe the console output. When do you see the message from the main thread?</w:t>
+      </w:r>
+    </w:p>
+    <w:p>
+      <w:pPr>
+        <w:rPr>
+          <w:lang w:val="en-US"/>
+        </w:rPr>
+      </w:pPr>
+    </w:p>
+    <w:p>
+      <w:pPr>
+        <w:rPr>
+          <w:b/>
+          <w:lang w:val="en-US"/>
+        </w:rPr>
+      </w:pPr>
+      <w:r>
+        <w:rPr>
+          <w:b/>
+          <w:lang w:val="en-US"/>
+        </w:rPr>
+        <w:t>Exercise 5:</w:t>
+      </w:r>
+    </w:p>
+    <w:p>
+      <w:pPr>
+        <w:rPr>
+          <w:lang w:val="en-US"/>
+        </w:rPr>
+      </w:pPr>
+      <w:r>
+        <w:rPr>
+          <w:lang w:val="en-US"/>
+        </w:rPr>
+        <w:t xml:space="preserve">Change your code, so the main thread </w:t>
+      </w:r>
+      <w:r>
+        <w:rPr>
+          <w:lang w:val="en-US"/>
+        </w:rPr>
+        <w:t>does not</w:t>
+      </w:r>
+      <w:r>
+        <w:rPr>
+          <w:lang w:val="en-US"/>
+        </w:rPr>
+        <w:t xml:space="preserve"> output “Hello from main” until </w:t>
+      </w:r>
+      <w:r>
+        <w:rPr>
+          <w:lang w:val="en-US"/>
+        </w:rPr>
+        <w:t xml:space="preserve">both your </w:t>
+      </w:r>
+      <w:proofErr w:type="spellStart"/>
+      <w:r>
+        <w:rPr>
+          <w:lang w:val="en-US"/>
+        </w:rPr>
+        <w:t>HelloWriter</w:t>
+      </w:r>
+      <w:proofErr w:type="spellEnd"/>
+      <w:r>
+        <w:rPr>
+          <w:lang w:val="en-US"/>
+        </w:rPr>
+        <w:t xml:space="preserve"> threads have finished.</w:t>
+      </w:r>
+    </w:p>
+    <w:p>
+      <w:pPr>
+        <w:rPr>
+          <w:lang w:val="en-US"/>
+        </w:rPr>
+      </w:pPr>
+    </w:p>
+    <w:p>
+      <w:pPr>
+        <w:rPr>
+          <w:b/>
+          <w:lang w:val="en-US"/>
+        </w:rPr>
+      </w:pPr>
+      <w:r>
+        <w:rPr>
+          <w:b/>
+          <w:lang w:val="en-US"/>
+        </w:rPr>
+        <w:t>Exercise 6:</w:t>
+      </w:r>
+    </w:p>
+    <w:p>
+      <w:pPr>
+        <w:rPr>
+          <w:lang w:val="en-US"/>
+        </w:rPr>
+      </w:pPr>
+      <w:r>
+        <w:rPr>
+          <w:lang w:val="en-US"/>
+        </w:rPr>
+        <w:t xml:space="preserve">Add a new thread, the </w:t>
+      </w:r>
+      <w:proofErr w:type="spellStart"/>
       <w:r>
         <w:rPr>
           <w:i/>
           <w:lang w:val="en-US"/>
         </w:rPr>
-        <w:t>Start(</w:t>
-      </w:r>
-      <w:proofErr w:type="gramEnd"/>
+        <w:t>NeverEndingStoryThread</w:t>
+      </w:r>
+      <w:proofErr w:type="spellEnd"/>
+      <w:r>
+        <w:rPr>
+          <w:lang w:val="en-US"/>
+        </w:rPr>
+        <w:t>, to your program. The thread shall run an endless loop, which writes “Never ending story” every 5 seconds. Run your program. What happens?</w:t>
+      </w:r>
+    </w:p>
+    <w:p>
+      <w:pPr>
+        <w:rPr>
+          <w:lang w:val="en-US"/>
+        </w:rPr>
+      </w:pPr>
+    </w:p>
+    <w:p>
+      <w:pPr>
+        <w:rPr>
+          <w:b/>
+          <w:lang w:val="en-US"/>
+        </w:rPr>
+      </w:pPr>
+      <w:r>
+        <w:rPr>
+          <w:b/>
+          <w:lang w:val="en-US"/>
+        </w:rPr>
+        <w:t>Exercise 7:</w:t>
+      </w:r>
+    </w:p>
+    <w:p>
+      <w:pPr>
+        <w:rPr>
+          <w:lang w:val="en-US"/>
+        </w:rPr>
+      </w:pPr>
+      <w:r>
+        <w:rPr>
+          <w:lang w:val="en-US"/>
+        </w:rPr>
+        <w:t xml:space="preserve">Change the </w:t>
+      </w:r>
+      <w:proofErr w:type="spellStart"/>
       <w:r>
         <w:rPr>
           <w:i/>
           <w:lang w:val="en-US"/>
         </w:rPr>
-        <w:t>)</w:t>
-      </w:r>
-      <w:r>
-        <w:rPr>
-          <w:lang w:val="en-US"/>
-        </w:rPr>
-        <w:t xml:space="preserve"> method on the thread.</w:t>
-      </w:r>
-    </w:p>
-    <w:p>
-      <w:pPr>
-        <w:rPr>
-          <w:lang w:val="en-US"/>
-        </w:rPr>
-      </w:pPr>
-    </w:p>
-    <w:p>
-      <w:pPr>
-        <w:rPr>
-          <w:lang w:val="en-US"/>
-        </w:rPr>
-      </w:pPr>
-      <w:r>
-        <w:rPr>
-          <w:lang w:val="en-US"/>
-        </w:rPr>
-        <w:t>Try implementing all three ways (one at the time).</w:t>
-      </w:r>
-    </w:p>
-    <w:p>
-      <w:pPr>
-        <w:rPr>
-          <w:lang w:val="en-US"/>
-        </w:rPr>
-      </w:pPr>
-      <w:r>
-        <w:rPr>
-          <w:lang w:val="en-US"/>
-        </w:rPr>
-        <w:t xml:space="preserve">Discuss with another student: Are there any benefits or drawbacks </w:t>
-      </w:r>
-      <w:r>
-        <w:rPr>
-          <w:lang w:val="en-US"/>
-        </w:rPr>
-        <w:t>of the different methods above?</w:t>
-      </w:r>
+        <w:t>NeverEndingStoryThread</w:t>
+      </w:r>
+      <w:proofErr w:type="spellEnd"/>
+      <w:r>
+        <w:rPr>
+          <w:lang w:val="en-US"/>
+        </w:rPr>
+        <w:t xml:space="preserve"> to be a background thread. What happens?</w:t>
+      </w:r>
+    </w:p>
+    <w:p>
+      <w:pPr>
+        <w:rPr>
+          <w:lang w:val="en-US"/>
+        </w:rPr>
+      </w:pPr>
     </w:p>
     <w:p>
       <w:pPr>
@@ -708,186 +994,77 @@
           <w:lang w:val="en-US"/>
         </w:rPr>
       </w:pPr>
-    </w:p>
-    <w:p>
-      <w:pPr>
+      <w:r>
         <w:rPr>
           <w:b/>
           <w:lang w:val="en-US"/>
         </w:rPr>
-      </w:pPr>
-      <w:r>
-        <w:rPr>
-          <w:b/>
-          <w:lang w:val="en-US"/>
-        </w:rPr>
-        <w:t>Exercise 3</w:t>
-      </w:r>
-      <w:r>
-        <w:rPr>
-          <w:b/>
-          <w:lang w:val="en-US"/>
-        </w:rPr>
-        <w:t>:</w:t>
-      </w:r>
-    </w:p>
-    <w:p>
-      <w:pPr>
-        <w:rPr>
-          <w:lang w:val="en-US"/>
-        </w:rPr>
-      </w:pPr>
-      <w:r>
-        <w:rPr>
-          <w:lang w:val="en-US"/>
-        </w:rPr>
-        <w:t xml:space="preserve">Make your </w:t>
+        <w:t>Exercise 8:</w:t>
+      </w:r>
+    </w:p>
+    <w:p>
+      <w:pPr>
+        <w:rPr>
+          <w:lang w:val="en-US"/>
+        </w:rPr>
+      </w:pPr>
+      <w:r>
+        <w:rPr>
+          <w:lang w:val="en-US"/>
+        </w:rPr>
+        <w:t xml:space="preserve">Change the </w:t>
       </w:r>
       <w:proofErr w:type="spellStart"/>
       <w:r>
         <w:rPr>
-          <w:lang w:val="en-US"/>
-        </w:rPr>
-        <w:t>HelloWriters</w:t>
+          <w:i/>
+          <w:lang w:val="en-US"/>
+        </w:rPr>
+        <w:t>NeverEndingStoryThread</w:t>
       </w:r>
       <w:proofErr w:type="spellEnd"/>
       <w:r>
         <w:rPr>
           <w:lang w:val="en-US"/>
         </w:rPr>
-        <w:t xml:space="preserve"> sleep between each output. One should sleep 200 </w:t>
+        <w:t xml:space="preserve"> back to being a foreground thread.</w:t>
+      </w:r>
+    </w:p>
+    <w:p>
+      <w:pPr>
+        <w:rPr>
+          <w:lang w:val="en-US"/>
+        </w:rPr>
+      </w:pPr>
+      <w:r>
+        <w:rPr>
+          <w:lang w:val="en-US"/>
+        </w:rPr>
+        <w:t xml:space="preserve">Add code, so the </w:t>
       </w:r>
       <w:proofErr w:type="spellStart"/>
       <w:r>
         <w:rPr>
-          <w:lang w:val="en-US"/>
-        </w:rPr>
-        <w:t>ms</w:t>
+          <w:i/>
+          <w:lang w:val="en-US"/>
+        </w:rPr>
+        <w:t>NeverEndingStoryThread</w:t>
       </w:r>
       <w:proofErr w:type="spellEnd"/>
       <w:r>
         <w:rPr>
           <w:lang w:val="en-US"/>
         </w:rPr>
-        <w:t xml:space="preserve"> and one should sleep 500 </w:t>
+        <w:t xml:space="preserve"> is stopped gracefully after your two </w:t>
       </w:r>
       <w:proofErr w:type="spellStart"/>
       <w:r>
         <w:rPr>
           <w:lang w:val="en-US"/>
         </w:rPr>
-        <w:t>ms.</w:t>
+        <w:t>HelloWriter</w:t>
       </w:r>
       <w:proofErr w:type="spellEnd"/>
-    </w:p>
-    <w:p>
-      <w:pPr>
-        <w:rPr>
-          <w:lang w:val="en-US"/>
-        </w:rPr>
-      </w:pPr>
-    </w:p>
-    <w:p>
-      <w:pPr>
-        <w:rPr>
-          <w:b/>
-          <w:lang w:val="en-US"/>
-        </w:rPr>
-      </w:pPr>
-      <w:r>
-        <w:rPr>
-          <w:b/>
-          <w:lang w:val="en-US"/>
-        </w:rPr>
-        <w:t>Exercise 4:</w:t>
-      </w:r>
-    </w:p>
-    <w:p>
-      <w:pPr>
-        <w:rPr>
-          <w:lang w:val="en-US"/>
-        </w:rPr>
-      </w:pPr>
-      <w:r>
-        <w:rPr>
-          <w:lang w:val="en-US"/>
-        </w:rPr>
-        <w:t>Make your main thread (the one staring the other threads) write “Hello from main” after starting the threads.</w:t>
-      </w:r>
-    </w:p>
-    <w:p>
-      <w:pPr>
-        <w:rPr>
-          <w:lang w:val="en-US"/>
-        </w:rPr>
-      </w:pPr>
-      <w:r>
-        <w:rPr>
-          <w:lang w:val="en-US"/>
-        </w:rPr>
-        <w:t>Observe the console output. When do you see the message from the main thread?</w:t>
-      </w:r>
-    </w:p>
-    <w:p>
-      <w:pPr>
-        <w:rPr>
-          <w:lang w:val="en-US"/>
-        </w:rPr>
-      </w:pPr>
-    </w:p>
-    <w:p>
-      <w:pPr>
-        <w:rPr>
-          <w:b/>
-          <w:lang w:val="en-US"/>
-        </w:rPr>
-      </w:pPr>
-      <w:r>
-        <w:rPr>
-          <w:b/>
-          <w:lang w:val="en-US"/>
-        </w:rPr>
-        <w:t>Exercise 5:</w:t>
-      </w:r>
-    </w:p>
-    <w:p>
-      <w:pPr>
-        <w:rPr>
-          <w:lang w:val="en-US"/>
-        </w:rPr>
-      </w:pPr>
-      <w:r>
-        <w:rPr>
-          <w:lang w:val="en-US"/>
-        </w:rPr>
-        <w:t xml:space="preserve">Change your code, so the main thread </w:t>
-      </w:r>
-      <w:r>
-        <w:rPr>
-          <w:lang w:val="en-US"/>
-        </w:rPr>
-        <w:t>does not</w:t>
-      </w:r>
-      <w:r>
-        <w:rPr>
-          <w:lang w:val="en-US"/>
-        </w:rPr>
-        <w:t xml:space="preserve"> output “Hello from main” until </w:t>
-      </w:r>
-      <w:r>
-        <w:rPr>
-          <w:lang w:val="en-US"/>
-        </w:rPr>
-        <w:t xml:space="preserve">both your </w:t>
-      </w:r>
-      <w:proofErr w:type="spellStart"/>
-      <w:r>
-        <w:rPr>
-          <w:lang w:val="en-US"/>
-        </w:rPr>
-        <w:t>HelloWriter</w:t>
-      </w:r>
-      <w:proofErr w:type="spellEnd"/>
       <w:r>
         <w:rPr>
           <w:lang w:val="en-US"/>
@@ -901,231 +1078,11 @@
           <w:lang w:val="en-US"/>
         </w:rPr>
       </w:pPr>
-    </w:p>
-    <w:p>
-      <w:pPr>
-        <w:rPr>
-          <w:b/>
-          <w:lang w:val="en-US"/>
-        </w:rPr>
-      </w:pPr>
-      <w:r>
-        <w:rPr>
-          <w:b/>
-          <w:lang w:val="en-US"/>
-        </w:rPr>
-        <w:t>Exercise 6:</w:t>
-      </w:r>
-    </w:p>
-    <w:p>
-      <w:pPr>
-        <w:rPr>
-          <w:lang w:val="en-US"/>
-        </w:rPr>
-      </w:pPr>
-      <w:r>
-        <w:rPr>
-          <w:lang w:val="en-US"/>
-        </w:rPr>
-        <w:t xml:space="preserve">Add a new thread, the </w:t>
-      </w:r>
-      <w:proofErr w:type="spellStart"/>
-      <w:r>
-        <w:rPr>
-          <w:i/>
-          <w:lang w:val="en-US"/>
-        </w:rPr>
-        <w:t>NeverEndingStoryThread</w:t>
-      </w:r>
-      <w:proofErr w:type="spellEnd"/>
-      <w:r>
-        <w:rPr>
-          <w:lang w:val="en-US"/>
-        </w:rPr>
-        <w:t>, to your program. The thread shall run an endless loop, which writes “Never ending story” every 5 seconds. Run your program. What happens?</w:t>
-      </w:r>
-    </w:p>
-    <w:p>
-      <w:pPr>
-        <w:rPr>
-          <w:lang w:val="en-US"/>
-        </w:rPr>
-      </w:pPr>
-    </w:p>
-    <w:p>
-      <w:pPr>
-        <w:rPr>
-          <w:b/>
-          <w:lang w:val="en-US"/>
-        </w:rPr>
-      </w:pPr>
-      <w:r>
-        <w:rPr>
-          <w:b/>
-          <w:lang w:val="en-US"/>
-        </w:rPr>
-        <w:t>Exercise 7:</w:t>
-      </w:r>
-    </w:p>
-    <w:p>
-      <w:pPr>
-        <w:rPr>
-          <w:lang w:val="en-US"/>
-        </w:rPr>
-      </w:pPr>
-      <w:r>
-        <w:rPr>
-          <w:lang w:val="en-US"/>
-        </w:rPr>
-        <w:t xml:space="preserve">Change the </w:t>
-      </w:r>
-      <w:proofErr w:type="spellStart"/>
-      <w:r>
-        <w:rPr>
-          <w:i/>
-          <w:lang w:val="en-US"/>
-        </w:rPr>
-        <w:t>NeverEndingStoryThread</w:t>
-      </w:r>
-      <w:proofErr w:type="spellEnd"/>
-      <w:r>
-        <w:rPr>
-          <w:lang w:val="en-US"/>
-        </w:rPr>
-        <w:t xml:space="preserve"> to be a background thread. What happens?</w:t>
-      </w:r>
-    </w:p>
-    <w:p>
-      <w:pPr>
-        <w:rPr>
-          <w:lang w:val="en-US"/>
-        </w:rPr>
-      </w:pPr>
-    </w:p>
-    <w:p>
-      <w:pPr>
-        <w:rPr>
-          <w:b/>
-          <w:lang w:val="en-US"/>
-        </w:rPr>
-      </w:pPr>
-      <w:r>
-        <w:rPr>
-          <w:b/>
-          <w:lang w:val="en-US"/>
-        </w:rPr>
-        <w:t>Exercise 8:</w:t>
-      </w:r>
-    </w:p>
-    <w:p>
-      <w:pPr>
-        <w:rPr>
-          <w:lang w:val="en-US"/>
-        </w:rPr>
-      </w:pPr>
-      <w:r>
-        <w:rPr>
-          <w:lang w:val="en-US"/>
-        </w:rPr>
-        <w:t xml:space="preserve">Change the </w:t>
-      </w:r>
-      <w:proofErr w:type="spellStart"/>
-      <w:r>
-        <w:rPr>
-          <w:i/>
-          <w:lang w:val="en-US"/>
-        </w:rPr>
-        <w:t>NeverEndingStoryThread</w:t>
-      </w:r>
-      <w:proofErr w:type="spellEnd"/>
-      <w:r>
-        <w:rPr>
-          <w:lang w:val="en-US"/>
-        </w:rPr>
-        <w:t xml:space="preserve"> back to being a foreground thread.</w:t>
-      </w:r>
-    </w:p>
-    <w:p>
-      <w:pPr>
-        <w:rPr>
-          <w:lang w:val="en-US"/>
-        </w:rPr>
-      </w:pPr>
-      <w:r>
-        <w:rPr>
-          <w:lang w:val="en-US"/>
-        </w:rPr>
-        <w:t xml:space="preserve">Add code, so the </w:t>
-      </w:r>
-      <w:proofErr w:type="spellStart"/>
-      <w:r>
-        <w:rPr>
-          <w:i/>
-          <w:lang w:val="en-US"/>
-        </w:rPr>
-        <w:t>NeverEndingStoryThread</w:t>
-      </w:r>
-      <w:proofErr w:type="spellEnd"/>
-      <w:r>
-        <w:rPr>
-          <w:lang w:val="en-US"/>
-        </w:rPr>
-        <w:t xml:space="preserve"> </w:t>
-      </w:r>
-      <w:proofErr w:type="gramStart"/>
-      <w:r>
-        <w:rPr>
-          <w:lang w:val="en-US"/>
-        </w:rPr>
-        <w:t>is stopped</w:t>
-      </w:r>
-      <w:proofErr w:type="gramEnd"/>
-      <w:r>
-        <w:rPr>
-          <w:lang w:val="en-US"/>
-        </w:rPr>
-        <w:t xml:space="preserve"> gracefully after your two </w:t>
-      </w:r>
-      <w:proofErr w:type="spellStart"/>
-      <w:r>
-        <w:rPr>
-          <w:lang w:val="en-US"/>
-        </w:rPr>
-        <w:t>HelloWriter</w:t>
-      </w:r>
-      <w:proofErr w:type="spellEnd"/>
-      <w:r>
-        <w:rPr>
-          <w:lang w:val="en-US"/>
-        </w:rPr>
-        <w:t xml:space="preserve"> threads have finished.</w:t>
-      </w:r>
-    </w:p>
-    <w:p>
-      <w:pPr>
-        <w:rPr>
-          <w:lang w:val="en-US"/>
-        </w:rPr>
-      </w:pPr>
-      <w:r>
-        <w:rPr>
-          <w:lang w:val="en-US"/>
-        </w:rPr>
-        <w:t xml:space="preserve">How long does it take </w:t>
-      </w:r>
-      <w:proofErr w:type="gramStart"/>
-      <w:r>
-        <w:rPr>
-          <w:lang w:val="en-US"/>
-        </w:rPr>
-        <w:t>for the</w:t>
-      </w:r>
-      <w:proofErr w:type="gramEnd"/>
-      <w:r>
-        <w:rPr>
-          <w:lang w:val="en-US"/>
-        </w:rPr>
-        <w:t xml:space="preserve"> program to stop?</w:t>
+      <w:r>
+        <w:rPr>
+          <w:lang w:val="en-US"/>
+        </w:rPr>
+        <w:t>How long does it take for the program to stop?</w:t>
       </w:r>
     </w:p>
     <w:p>
@@ -1154,8 +1111,6 @@
           <w:lang w:val="en-US"/>
         </w:rPr>
       </w:pPr>
-      <w:bookmarkStart w:id="0" w:name="_GoBack"/>
-      <w:bookmarkEnd w:id="0"/>
     </w:p>
     <w:sectPr>
       <w:headerReference w:type="default" r:id="rId7"/>
@@ -1170,7 +1125,7 @@
 </file>
 
 <file path=word/endnotes.xml><?xml version="1.0" encoding="utf-8"?>
-<w:endnotes xmlns:wpc="http://schemas.microsoft.com/office/word/2010/wordprocessingCanvas" xmlns:cx="http://schemas.microsoft.com/office/drawing/2014/chartex" xmlns:cx1="http://schemas.microsoft.com/office/drawing/2015/9/8/chartex" xmlns:mc="http://schemas.openxmlformats.org/markup-compatibility/2006" xmlns:o="urn:schemas-microsoft-com:office:office" xmlns:r="http://schemas.openxmlformats.org/officeDocument/2006/relationships" xmlns:m="http://schemas.openxmlformats.org/officeDocument/2006/math" xmlns:v="urn:schemas-microsoft-com:vml" xmlns:wp14="http://schemas.microsoft.com/office/word/2010/wordprocessingDrawing" xmlns:wp="http://schemas.openxmlformats.org/drawingml/2006/wordprocessingDrawing" xmlns:w10="urn:schemas-microsoft-com:office:word" xmlns:w="http://schemas.openxmlformats.org/wordprocessingml/2006/main" xmlns:w14="http://schemas.microsoft.com/office/word/2010/wordml" xmlns:w15="http://schemas.microsoft.com/office/word/2012/wordml" xmlns:w16se="http://schemas.microsoft.com/office/word/2015/wordml/symex" xmlns:wpg="http://schemas.microsoft.com/office/word/2010/wordprocessingGroup" xmlns:wpi="http://schemas.microsoft.com/office/word/2010/wordprocessingInk" xmlns:wne="http://schemas.microsoft.com/office/word/2006/wordml" xmlns:wps="http://schemas.microsoft.com/office/word/2010/wordprocessingShape" mc:Ignorable="w14 w15 w16se wp14">
+<w:endnotes xmlns:wpc="http://schemas.microsoft.com/office/word/2010/wordprocessingCanvas" xmlns:cx="http://schemas.microsoft.com/office/drawing/2014/chartex" xmlns:cx1="http://schemas.microsoft.com/office/drawing/2015/9/8/chartex" xmlns:cx2="http://schemas.microsoft.com/office/drawing/2015/10/21/chartex" xmlns:cx3="http://schemas.microsoft.com/office/drawing/2016/5/9/chartex" xmlns:cx4="http://schemas.microsoft.com/office/drawing/2016/5/10/chartex" xmlns:cx5="http://schemas.microsoft.com/office/drawing/2016/5/11/chartex" xmlns:cx6="http://schemas.microsoft.com/office/drawing/2016/5/12/chartex" xmlns:cx7="http://schemas.microsoft.com/office/drawing/2016/5/13/chartex" xmlns:cx8="http://schemas.microsoft.com/office/drawing/2016/5/14/chartex" xmlns:mc="http://schemas.openxmlformats.org/markup-compatibility/2006" xmlns:aink="http://schemas.microsoft.com/office/drawing/2016/ink" xmlns:am3d="http://schemas.microsoft.com/office/drawing/2017/model3d" xmlns:o="urn:schemas-microsoft-com:office:office" xmlns:oel="http://schemas.microsoft.com/office/2019/extlst" xmlns:r="http://schemas.openxmlformats.org/officeDocument/2006/relationships" xmlns:m="http://schemas.openxmlformats.org/officeDocument/2006/math" xmlns:v="urn:schemas-microsoft-com:vml" xmlns:wp14="http://schemas.microsoft.com/office/word/2010/wordprocessingDrawing" xmlns:wp="http://schemas.openxmlformats.org/drawingml/2006/wordprocessingDrawing" xmlns:w10="urn:schemas-microsoft-com:office:word" xmlns:w="http://schemas.openxmlformats.org/wordprocessingml/2006/main" xmlns:w14="http://schemas.microsoft.com/office/word/2010/wordml" xmlns:w15="http://schemas.microsoft.com/office/word/2012/wordml" xmlns:w16cex="http://schemas.microsoft.com/office/word/2018/wordml/cex" xmlns:w16cid="http://schemas.microsoft.com/office/word/2016/wordml/cid" xmlns:w16="http://schemas.microsoft.com/office/word/2018/wordml" xmlns:w16du="http://schemas.microsoft.com/office/word/2023/wordml/word16du" xmlns:w16sdtdh="http://schemas.microsoft.com/office/word/2020/wordml/sdtdatahash" xmlns:w16sdtfl="http://schemas.microsoft.com/office/word/2024/wordml/sdtformatlock" xmlns:w16se="http://schemas.microsoft.com/office/word/2015/wordml/symex" xmlns:wpg="http://schemas.microsoft.com/office/word/2010/wordprocessingGroup" xmlns:wpi="http://schemas.microsoft.com/office/word/2010/wordprocessingInk" xmlns:wne="http://schemas.microsoft.com/office/word/2006/wordml" xmlns:wps="http://schemas.microsoft.com/office/word/2010/wordprocessingShape" mc:Ignorable="w14 w15 w16se w16cid w16 w16cex w16sdtdh w16sdtfl w16du wp14">
   <w:endnote w:type="separator" w:id="-1">
     <w:p>
       <w:r>
@@ -1189,7 +1144,7 @@
 </file>
 
 <file path=word/footer1.xml><?xml version="1.0" encoding="utf-8"?>
-<w:ftr xmlns:wpc="http://schemas.microsoft.com/office/word/2010/wordprocessingCanvas" xmlns:cx="http://schemas.microsoft.com/office/drawing/2014/chartex" xmlns:cx1="http://schemas.microsoft.com/office/drawing/2015/9/8/chartex" xmlns:mc="http://schemas.openxmlformats.org/markup-compatibility/2006" xmlns:o="urn:schemas-microsoft-com:office:office" xmlns:r="http://schemas.openxmlformats.org/officeDocument/2006/relationships" xmlns:m="http://schemas.openxmlformats.org/officeDocument/2006/math" xmlns:v="urn:schemas-microsoft-com:vml" xmlns:wp14="http://schemas.microsoft.com/office/word/2010/wordprocessingDrawing" xmlns:wp="http://schemas.openxmlformats.org/drawingml/2006/wordprocessingDrawing" xmlns:w10="urn:schemas-microsoft-com:office:word" xmlns:w="http://schemas.openxmlformats.org/wordprocessingml/2006/main" xmlns:w14="http://schemas.microsoft.com/office/word/2010/wordml" xmlns:w15="http://schemas.microsoft.com/office/word/2012/wordml" xmlns:w16se="http://schemas.microsoft.com/office/word/2015/wordml/symex" xmlns:wpg="http://schemas.microsoft.com/office/word/2010/wordprocessingGroup" xmlns:wpi="http://schemas.microsoft.com/office/word/2010/wordprocessingInk" xmlns:wne="http://schemas.microsoft.com/office/word/2006/wordml" xmlns:wps="http://schemas.microsoft.com/office/word/2010/wordprocessingShape" mc:Ignorable="w14 w15 w16se wp14">
+<w:ftr xmlns:wpc="http://schemas.microsoft.com/office/word/2010/wordprocessingCanvas" xmlns:cx="http://schemas.microsoft.com/office/drawing/2014/chartex" xmlns:cx1="http://schemas.microsoft.com/office/drawing/2015/9/8/chartex" xmlns:cx2="http://schemas.microsoft.com/office/drawing/2015/10/21/chartex" xmlns:cx3="http://schemas.microsoft.com/office/drawing/2016/5/9/chartex" xmlns:cx4="http://schemas.microsoft.com/office/drawing/2016/5/10/chartex" xmlns:cx5="http://schemas.microsoft.com/office/drawing/2016/5/11/chartex" xmlns:cx6="http://schemas.microsoft.com/office/drawing/2016/5/12/chartex" xmlns:cx7="http://schemas.microsoft.com/office/drawing/2016/5/13/chartex" xmlns:cx8="http://schemas.microsoft.com/office/drawing/2016/5/14/chartex" xmlns:mc="http://schemas.openxmlformats.org/markup-compatibility/2006" xmlns:aink="http://schemas.microsoft.com/office/drawing/2016/ink" xmlns:am3d="http://schemas.microsoft.com/office/drawing/2017/model3d" xmlns:o="urn:schemas-microsoft-com:office:office" xmlns:oel="http://schemas.microsoft.com/office/2019/extlst" xmlns:r="http://schemas.openxmlformats.org/officeDocument/2006/relationships" xmlns:m="http://schemas.openxmlformats.org/officeDocument/2006/math" xmlns:v="urn:schemas-microsoft-com:vml" xmlns:wp14="http://schemas.microsoft.com/office/word/2010/wordprocessingDrawing" xmlns:wp="http://schemas.openxmlformats.org/drawingml/2006/wordprocessingDrawing" xmlns:w10="urn:schemas-microsoft-com:office:word" xmlns:w="http://schemas.openxmlformats.org/wordprocessingml/2006/main" xmlns:w14="http://schemas.microsoft.com/office/word/2010/wordml" xmlns:w15="http://schemas.microsoft.com/office/word/2012/wordml" xmlns:w16cex="http://schemas.microsoft.com/office/word/2018/wordml/cex" xmlns:w16cid="http://schemas.microsoft.com/office/word/2016/wordml/cid" xmlns:w16="http://schemas.microsoft.com/office/word/2018/wordml" xmlns:w16du="http://schemas.microsoft.com/office/word/2023/wordml/word16du" xmlns:w16sdtdh="http://schemas.microsoft.com/office/word/2020/wordml/sdtdatahash" xmlns:w16sdtfl="http://schemas.microsoft.com/office/word/2024/wordml/sdtformatlock" xmlns:w16se="http://schemas.microsoft.com/office/word/2015/wordml/symex" xmlns:wpg="http://schemas.microsoft.com/office/word/2010/wordprocessingGroup" xmlns:wpi="http://schemas.microsoft.com/office/word/2010/wordprocessingInk" xmlns:wne="http://schemas.microsoft.com/office/word/2006/wordml" xmlns:wps="http://schemas.microsoft.com/office/word/2010/wordprocessingShape" mc:Ignorable="w14 w15 w16se w16cid w16 w16cex w16sdtdh w16sdtfl w16du wp14">
   <w:sdt>
     <w:sdtPr>
       <w:rPr>
@@ -1203,7 +1158,6 @@
         <w:docPartUnique/>
       </w:docPartObj>
     </w:sdtPr>
-    <w:sdtEndPr/>
     <w:sdtContent>
       <w:sdt>
         <w:sdtPr>
@@ -1218,7 +1172,6 @@
             <w:docPartUnique/>
           </w:docPartObj>
         </w:sdtPr>
-        <w:sdtEndPr/>
         <w:sdtContent>
           <w:p>
             <w:pPr>
@@ -1355,7 +1308,7 @@
 </file>
 
 <file path=word/footnotes.xml><?xml version="1.0" encoding="utf-8"?>
-<w:footnotes xmlns:wpc="http://schemas.microsoft.com/office/word/2010/wordprocessingCanvas" xmlns:cx="http://schemas.microsoft.com/office/drawing/2014/chartex" xmlns:cx1="http://schemas.microsoft.com/office/drawing/2015/9/8/chartex" xmlns:mc="http://schemas.openxmlformats.org/markup-compatibility/2006" xmlns:o="urn:schemas-microsoft-com:office:office" xmlns:r="http://schemas.openxmlformats.org/officeDocument/2006/relationships" xmlns:m="http://schemas.openxmlformats.org/officeDocument/2006/math" xmlns:v="urn:schemas-microsoft-com:vml" xmlns:wp14="http://schemas.microsoft.com/office/word/2010/wordprocessingDrawing" xmlns:wp="http://schemas.openxmlformats.org/drawingml/2006/wordprocessingDrawing" xmlns:w10="urn:schemas-microsoft-com:office:word" xmlns:w="http://schemas.openxmlformats.org/wordprocessingml/2006/main" xmlns:w14="http://schemas.microsoft.com/office/word/2010/wordml" xmlns:w15="http://schemas.microsoft.com/office/word/2012/wordml" xmlns:w16se="http://schemas.microsoft.com/office/word/2015/wordml/symex" xmlns:wpg="http://schemas.microsoft.com/office/word/2010/wordprocessingGroup" xmlns:wpi="http://schemas.microsoft.com/office/word/2010/wordprocessingInk" xmlns:wne="http://schemas.microsoft.com/office/word/2006/wordml" xmlns:wps="http://schemas.microsoft.com/office/word/2010/wordprocessingShape" mc:Ignorable="w14 w15 w16se wp14">
+<w:footnotes xmlns:wpc="http://schemas.microsoft.com/office/word/2010/wordprocessingCanvas" xmlns:cx="http://schemas.microsoft.com/office/drawing/2014/chartex" xmlns:cx1="http://schemas.microsoft.com/office/drawing/2015/9/8/chartex" xmlns:cx2="http://schemas.microsoft.com/office/drawing/2015/10/21/chartex" xmlns:cx3="http://schemas.microsoft.com/office/drawing/2016/5/9/chartex" xmlns:cx4="http://schemas.microsoft.com/office/drawing/2016/5/10/chartex" xmlns:cx5="http://schemas.microsoft.com/office/drawing/2016/5/11/chartex" xmlns:cx6="http://schemas.microsoft.com/office/drawing/2016/5/12/chartex" xmlns:cx7="http://schemas.microsoft.com/office/drawing/2016/5/13/chartex" xmlns:cx8="http://schemas.microsoft.com/office/drawing/2016/5/14/chartex" xmlns:mc="http://schemas.openxmlformats.org/markup-compatibility/2006" xmlns:aink="http://schemas.microsoft.com/office/drawing/2016/ink" xmlns:am3d="http://schemas.microsoft.com/office/drawing/2017/model3d" xmlns:o="urn:schemas-microsoft-com:office:office" xmlns:oel="http://schemas.microsoft.com/office/2019/extlst" xmlns:r="http://schemas.openxmlformats.org/officeDocument/2006/relationships" xmlns:m="http://schemas.openxmlformats.org/officeDocument/2006/math" xmlns:v="urn:schemas-microsoft-com:vml" xmlns:wp14="http://schemas.microsoft.com/office/word/2010/wordprocessingDrawing" xmlns:wp="http://schemas.openxmlformats.org/drawingml/2006/wordprocessingDrawing" xmlns:w10="urn:schemas-microsoft-com:office:word" xmlns:w="http://schemas.openxmlformats.org/wordprocessingml/2006/main" xmlns:w14="http://schemas.microsoft.com/office/word/2010/wordml" xmlns:w15="http://schemas.microsoft.com/office/word/2012/wordml" xmlns:w16cex="http://schemas.microsoft.com/office/word/2018/wordml/cex" xmlns:w16cid="http://schemas.microsoft.com/office/word/2016/wordml/cid" xmlns:w16="http://schemas.microsoft.com/office/word/2018/wordml" xmlns:w16du="http://schemas.microsoft.com/office/word/2023/wordml/word16du" xmlns:w16sdtdh="http://schemas.microsoft.com/office/word/2020/wordml/sdtdatahash" xmlns:w16sdtfl="http://schemas.microsoft.com/office/word/2024/wordml/sdtformatlock" xmlns:w16se="http://schemas.microsoft.com/office/word/2015/wordml/symex" xmlns:wpg="http://schemas.microsoft.com/office/word/2010/wordprocessingGroup" xmlns:wpi="http://schemas.microsoft.com/office/word/2010/wordprocessingInk" xmlns:wne="http://schemas.microsoft.com/office/word/2006/wordml" xmlns:wps="http://schemas.microsoft.com/office/word/2010/wordprocessingShape" mc:Ignorable="w14 w15 w16se w16cid w16 w16cex w16sdtdh w16sdtfl w16du wp14">
   <w:footnote w:type="separator" w:id="-1">
     <w:p>
       <w:r>
@@ -1374,7 +1327,7 @@
 </file>
 
 <file path=word/header1.xml><?xml version="1.0" encoding="utf-8"?>
-<w:hdr xmlns:wpc="http://schemas.microsoft.com/office/word/2010/wordprocessingCanvas" xmlns:cx="http://schemas.microsoft.com/office/drawing/2014/chartex" xmlns:cx1="http://schemas.microsoft.com/office/drawing/2015/9/8/chartex" xmlns:mc="http://schemas.openxmlformats.org/markup-compatibility/2006" xmlns:o="urn:schemas-microsoft-com:office:office" xmlns:r="http://schemas.openxmlformats.org/officeDocument/2006/relationships" xmlns:m="http://schemas.openxmlformats.org/officeDocument/2006/math" xmlns:v="urn:schemas-microsoft-com:vml" xmlns:wp14="http://schemas.microsoft.com/office/word/2010/wordprocessingDrawing" xmlns:wp="http://schemas.openxmlformats.org/drawingml/2006/wordprocessingDrawing" xmlns:w10="urn:schemas-microsoft-com:office:word" xmlns:w="http://schemas.openxmlformats.org/wordprocessingml/2006/main" xmlns:w14="http://schemas.microsoft.com/office/word/2010/wordml" xmlns:w15="http://schemas.microsoft.com/office/word/2012/wordml" xmlns:w16se="http://schemas.microsoft.com/office/word/2015/wordml/symex" xmlns:wpg="http://schemas.microsoft.com/office/word/2010/wordprocessingGroup" xmlns:wpi="http://schemas.microsoft.com/office/word/2010/wordprocessingInk" xmlns:wne="http://schemas.microsoft.com/office/word/2006/wordml" xmlns:wps="http://schemas.microsoft.com/office/word/2010/wordprocessingShape" mc:Ignorable="w14 w15 w16se wp14">
+<w:hdr xmlns:wpc="http://schemas.microsoft.com/office/word/2010/wordprocessingCanvas" xmlns:cx="http://schemas.microsoft.com/office/drawing/2014/chartex" xmlns:cx1="http://schemas.microsoft.com/office/drawing/2015/9/8/chartex" xmlns:cx2="http://schemas.microsoft.com/office/drawing/2015/10/21/chartex" xmlns:cx3="http://schemas.microsoft.com/office/drawing/2016/5/9/chartex" xmlns:cx4="http://schemas.microsoft.com/office/drawing/2016/5/10/chartex" xmlns:cx5="http://schemas.microsoft.com/office/drawing/2016/5/11/chartex" xmlns:cx6="http://schemas.microsoft.com/office/drawing/2016/5/12/chartex" xmlns:cx7="http://schemas.microsoft.com/office/drawing/2016/5/13/chartex" xmlns:cx8="http://schemas.microsoft.com/office/drawing/2016/5/14/chartex" xmlns:mc="http://schemas.openxmlformats.org/markup-compatibility/2006" xmlns:aink="http://schemas.microsoft.com/office/drawing/2016/ink" xmlns:am3d="http://schemas.microsoft.com/office/drawing/2017/model3d" xmlns:o="urn:schemas-microsoft-com:office:office" xmlns:oel="http://schemas.microsoft.com/office/2019/extlst" xmlns:r="http://schemas.openxmlformats.org/officeDocument/2006/relationships" xmlns:m="http://schemas.openxmlformats.org/officeDocument/2006/math" xmlns:v="urn:schemas-microsoft-com:vml" xmlns:wp14="http://schemas.microsoft.com/office/word/2010/wordprocessingDrawing" xmlns:wp="http://schemas.openxmlformats.org/drawingml/2006/wordprocessingDrawing" xmlns:w10="urn:schemas-microsoft-com:office:word" xmlns:w="http://schemas.openxmlformats.org/wordprocessingml/2006/main" xmlns:w14="http://schemas.microsoft.com/office/word/2010/wordml" xmlns:w15="http://schemas.microsoft.com/office/word/2012/wordml" xmlns:w16cex="http://schemas.microsoft.com/office/word/2018/wordml/cex" xmlns:w16cid="http://schemas.microsoft.com/office/word/2016/wordml/cid" xmlns:w16="http://schemas.microsoft.com/office/word/2018/wordml" xmlns:w16du="http://schemas.microsoft.com/office/word/2023/wordml/word16du" xmlns:w16sdtdh="http://schemas.microsoft.com/office/word/2020/wordml/sdtdatahash" xmlns:w16sdtfl="http://schemas.microsoft.com/office/word/2024/wordml/sdtformatlock" xmlns:w16se="http://schemas.microsoft.com/office/word/2015/wordml/symex" xmlns:wpg="http://schemas.microsoft.com/office/word/2010/wordprocessingGroup" xmlns:wpi="http://schemas.microsoft.com/office/word/2010/wordprocessingInk" xmlns:wne="http://schemas.microsoft.com/office/word/2006/wordml" xmlns:wps="http://schemas.microsoft.com/office/word/2010/wordprocessingShape" mc:Ignorable="w14 w15 w16se w16cid w16 w16cex w16sdtdh w16sdtfl w16du wp14">
   <w:p>
     <w:pPr>
       <w:pStyle w:val="Header"/>
@@ -1590,7 +1543,7 @@
 </file>
 
 <file path=word/numbering.xml><?xml version="1.0" encoding="utf-8"?>
-<w:numbering xmlns:wpc="http://schemas.microsoft.com/office/word/2010/wordprocessingCanvas" xmlns:cx="http://schemas.microsoft.com/office/drawing/2014/chartex" xmlns:cx1="http://schemas.microsoft.com/office/drawing/2015/9/8/chartex" xmlns:mc="http://schemas.openxmlformats.org/markup-compatibility/2006" xmlns:o="urn:schemas-microsoft-com:office:office" xmlns:r="http://schemas.openxmlformats.org/officeDocument/2006/relationships" xmlns:m="http://schemas.openxmlformats.org/officeDocument/2006/math" xmlns:v="urn:schemas-microsoft-com:vml" xmlns:wp14="http://schemas.microsoft.com/office/word/2010/wordprocessingDrawing" xmlns:wp="http://schemas.openxmlformats.org/drawingml/2006/wordprocessingDrawing" xmlns:w10="urn:schemas-microsoft-com:office:word" xmlns:w="http://schemas.openxmlformats.org/wordprocessingml/2006/main" xmlns:w14="http://schemas.microsoft.com/office/word/2010/wordml" xmlns:w15="http://schemas.microsoft.com/office/word/2012/wordml" xmlns:w16se="http://schemas.microsoft.com/office/word/2015/wordml/symex" xmlns:wpg="http://schemas.microsoft.com/office/word/2010/wordprocessingGroup" xmlns:wpi="http://schemas.microsoft.com/office/word/2010/wordprocessingInk" xmlns:wne="http://schemas.microsoft.com/office/word/2006/wordml" xmlns:wps="http://schemas.microsoft.com/office/word/2010/wordprocessingShape" mc:Ignorable="w14 w15 w16se wp14">
+<w:numbering xmlns:wpc="http://schemas.microsoft.com/office/word/2010/wordprocessingCanvas" xmlns:cx="http://schemas.microsoft.com/office/drawing/2014/chartex" xmlns:cx1="http://schemas.microsoft.com/office/drawing/2015/9/8/chartex" xmlns:cx2="http://schemas.microsoft.com/office/drawing/2015/10/21/chartex" xmlns:cx3="http://schemas.microsoft.com/office/drawing/2016/5/9/chartex" xmlns:cx4="http://schemas.microsoft.com/office/drawing/2016/5/10/chartex" xmlns:cx5="http://schemas.microsoft.com/office/drawing/2016/5/11/chartex" xmlns:cx6="http://schemas.microsoft.com/office/drawing/2016/5/12/chartex" xmlns:cx7="http://schemas.microsoft.com/office/drawing/2016/5/13/chartex" xmlns:cx8="http://schemas.microsoft.com/office/drawing/2016/5/14/chartex" xmlns:mc="http://schemas.openxmlformats.org/markup-compatibility/2006" xmlns:aink="http://schemas.microsoft.com/office/drawing/2016/ink" xmlns:am3d="http://schemas.microsoft.com/office/drawing/2017/model3d" xmlns:o="urn:schemas-microsoft-com:office:office" xmlns:oel="http://schemas.microsoft.com/office/2019/extlst" xmlns:r="http://schemas.openxmlformats.org/officeDocument/2006/relationships" xmlns:m="http://schemas.openxmlformats.org/officeDocument/2006/math" xmlns:v="urn:schemas-microsoft-com:vml" xmlns:wp14="http://schemas.microsoft.com/office/word/2010/wordprocessingDrawing" xmlns:wp="http://schemas.openxmlformats.org/drawingml/2006/wordprocessingDrawing" xmlns:w10="urn:schemas-microsoft-com:office:word" xmlns:w="http://schemas.openxmlformats.org/wordprocessingml/2006/main" xmlns:w14="http://schemas.microsoft.com/office/word/2010/wordml" xmlns:w15="http://schemas.microsoft.com/office/word/2012/wordml" xmlns:w16cex="http://schemas.microsoft.com/office/word/2018/wordml/cex" xmlns:w16cid="http://schemas.microsoft.com/office/word/2016/wordml/cid" xmlns:w16="http://schemas.microsoft.com/office/word/2018/wordml" xmlns:w16du="http://schemas.microsoft.com/office/word/2023/wordml/word16du" xmlns:w16sdtdh="http://schemas.microsoft.com/office/word/2020/wordml/sdtdatahash" xmlns:w16sdtfl="http://schemas.microsoft.com/office/word/2024/wordml/sdtformatlock" xmlns:w16se="http://schemas.microsoft.com/office/word/2015/wordml/symex" xmlns:wpg="http://schemas.microsoft.com/office/word/2010/wordprocessingGroup" xmlns:wpi="http://schemas.microsoft.com/office/word/2010/wordprocessingInk" xmlns:wne="http://schemas.microsoft.com/office/word/2006/wordml" xmlns:wps="http://schemas.microsoft.com/office/word/2010/wordprocessingShape" mc:Ignorable="w14 w15 w16se w16cid w16 w16cex w16sdtdh w16sdtfl w16du wp14">
   <w:abstractNum w:abstractNumId="0" w15:restartNumberingAfterBreak="0">
     <w:nsid w:val="2DFB2120"/>
     <w:multiLevelType w:val="hybridMultilevel"/>
@@ -2132,59 +2085,59 @@
       </w:rPr>
     </w:lvl>
   </w:abstractNum>
-  <w:num w:numId="1">
+  <w:num w:numId="1" w16cid:durableId="1153595837">
     <w:abstractNumId w:val="2"/>
   </w:num>
-  <w:num w:numId="2">
+  <w:num w:numId="2" w16cid:durableId="341708155">
     <w:abstractNumId w:val="2"/>
   </w:num>
-  <w:num w:numId="3">
+  <w:num w:numId="3" w16cid:durableId="1826044612">
     <w:abstractNumId w:val="2"/>
   </w:num>
-  <w:num w:numId="4">
+  <w:num w:numId="4" w16cid:durableId="303895473">
     <w:abstractNumId w:val="2"/>
   </w:num>
-  <w:num w:numId="5">
+  <w:num w:numId="5" w16cid:durableId="816918745">
     <w:abstractNumId w:val="2"/>
   </w:num>
-  <w:num w:numId="6">
+  <w:num w:numId="6" w16cid:durableId="1443920898">
     <w:abstractNumId w:val="2"/>
   </w:num>
-  <w:num w:numId="7">
+  <w:num w:numId="7" w16cid:durableId="513226935">
     <w:abstractNumId w:val="2"/>
   </w:num>
-  <w:num w:numId="8">
+  <w:num w:numId="8" w16cid:durableId="1193880659">
     <w:abstractNumId w:val="2"/>
   </w:num>
-  <w:num w:numId="9">
+  <w:num w:numId="9" w16cid:durableId="2137867741">
     <w:abstractNumId w:val="2"/>
   </w:num>
-  <w:num w:numId="10">
+  <w:num w:numId="10" w16cid:durableId="814025426">
     <w:abstractNumId w:val="2"/>
   </w:num>
-  <w:num w:numId="11">
+  <w:num w:numId="11" w16cid:durableId="493691010">
     <w:abstractNumId w:val="2"/>
   </w:num>
-  <w:num w:numId="12">
+  <w:num w:numId="12" w16cid:durableId="487211379">
     <w:abstractNumId w:val="2"/>
   </w:num>
-  <w:num w:numId="13">
+  <w:num w:numId="13" w16cid:durableId="1020856322">
     <w:abstractNumId w:val="0"/>
   </w:num>
-  <w:num w:numId="14">
+  <w:num w:numId="14" w16cid:durableId="1684167939">
     <w:abstractNumId w:val="4"/>
   </w:num>
-  <w:num w:numId="15">
+  <w:num w:numId="15" w16cid:durableId="1326055954">
     <w:abstractNumId w:val="3"/>
   </w:num>
-  <w:num w:numId="16">
+  <w:num w:numId="16" w16cid:durableId="1211917481">
     <w:abstractNumId w:val="1"/>
   </w:num>
 </w:numbering>
 </file>
 
 <file path=word/styles.xml><?xml version="1.0" encoding="utf-8"?>
-<w:styles xmlns:mc="http://schemas.openxmlformats.org/markup-compatibility/2006" xmlns:r="http://schemas.openxmlformats.org/officeDocument/2006/relationships" xmlns:w="http://schemas.openxmlformats.org/wordprocessingml/2006/main" xmlns:w14="http://schemas.microsoft.com/office/word/2010/wordml" xmlns:w15="http://schemas.microsoft.com/office/word/2012/wordml" xmlns:w16se="http://schemas.microsoft.com/office/word/2015/wordml/symex" mc:Ignorable="w14 w15 w16se">
+<w:styles xmlns:mc="http://schemas.openxmlformats.org/markup-compatibility/2006" xmlns:r="http://schemas.openxmlformats.org/officeDocument/2006/relationships" xmlns:w="http://schemas.openxmlformats.org/wordprocessingml/2006/main" xmlns:w14="http://schemas.microsoft.com/office/word/2010/wordml" xmlns:w15="http://schemas.microsoft.com/office/word/2012/wordml" xmlns:w16cex="http://schemas.microsoft.com/office/word/2018/wordml/cex" xmlns:w16cid="http://schemas.microsoft.com/office/word/2016/wordml/cid" xmlns:w16="http://schemas.microsoft.com/office/word/2018/wordml" xmlns:w16du="http://schemas.microsoft.com/office/word/2023/wordml/word16du" xmlns:w16sdtdh="http://schemas.microsoft.com/office/word/2020/wordml/sdtdatahash" xmlns:w16sdtfl="http://schemas.microsoft.com/office/word/2024/wordml/sdtformatlock" xmlns:w16se="http://schemas.microsoft.com/office/word/2015/wordml/symex" mc:Ignorable="w14 w15 w16se w16cid w16 w16cex w16sdtdh w16sdtfl w16du">
   <w:docDefaults>
     <w:rPrDefault>
       <w:rPr>
@@ -2200,7 +2153,7 @@
       </w:pPr>
     </w:pPrDefault>
   </w:docDefaults>
-  <w:latentStyles w:defLockedState="0" w:defUIPriority="99" w:defSemiHidden="0" w:defUnhideWhenUsed="0" w:defQFormat="0" w:count="371">
+  <w:latentStyles w:defLockedState="0" w:defUIPriority="99" w:defSemiHidden="0" w:defUnhideWhenUsed="0" w:defQFormat="0" w:count="376">
     <w:lsdException w:name="Normal" w:uiPriority="0" w:qFormat="1"/>
     <w:lsdException w:name="heading 1" w:uiPriority="9" w:qFormat="1"/>
     <w:lsdException w:name="heading 2" w:semiHidden="1" w:uiPriority="9" w:unhideWhenUsed="1" w:qFormat="1"/>
@@ -2572,6 +2525,11 @@
     <w:lsdException w:name="List Table 5 Dark Accent 6" w:uiPriority="50"/>
     <w:lsdException w:name="List Table 6 Colorful Accent 6" w:uiPriority="51"/>
     <w:lsdException w:name="List Table 7 Colorful Accent 6" w:uiPriority="52"/>
+    <w:lsdException w:name="Mention" w:semiHidden="1" w:unhideWhenUsed="1"/>
+    <w:lsdException w:name="Smart Hyperlink" w:semiHidden="1" w:unhideWhenUsed="1"/>
+    <w:lsdException w:name="Hashtag" w:semiHidden="1" w:unhideWhenUsed="1"/>
+    <w:lsdException w:name="Unresolved Mention" w:semiHidden="1" w:unhideWhenUsed="1"/>
+    <w:lsdException w:name="Smart Link" w:semiHidden="1" w:unhideWhenUsed="1"/>
   </w:latentStyles>
   <w:style w:type="paragraph" w:default="1" w:styleId="Normal">
     <w:name w:val="Normal"/>
@@ -3260,4 +3218,10 @@
   <a:objectDefaults/>
   <a:extraClrSchemeLst/>
 </a:theme>
+</file>
+
+<file path=docMetadata/LabelInfo.xml><?xml version="1.0" encoding="utf-8"?>
+<clbl:labelList xmlns:clbl="http://schemas.microsoft.com/office/2020/mipLabelMetadata">
+  <clbl:label id="{61fd1d36-fecb-47ca-b7d7-d0df0370a198}" enabled="0" method="" siteId="{61fd1d36-fecb-47ca-b7d7-d0df0370a198}" removed="1"/>
+</clbl:labelList>
 </file>
</xml_diff>